<commit_message>
Share code between the Office previews, richer DOCX sample
- Move format-independent OOXML modules (xml, package, color, theme)
  from pptx/ to ooxml/, add ooxml/text.ts (toRoman, safeHref) and
  shared test builders.
- Add preview-shared/: base64 and object-URL helpers, zoom controls,
  a ResizeObserver size hook, and the CSV/Excel data table.
- Replace preview-samples/sample.docx with a richer document.
- DOCX: pull right and center tab stops past the line end back to it,
  so contents-list page numbers no longer wrap.
</commit_message>
<xml_diff>
--- a/preview-samples/sample.docx
+++ b/preview-samples/sample.docx
@@ -7,19 +7,243 @@
         <w:pStyle w:val="Title"/>
       </w:pPr>
       <w:r>
-        <w:t>Quarterly Report</w:t>
+        <w:t>Release Notes Sample</w:t>
       </w:r>
     </w:p>
     <w:p>
       <w:pPr>
-        <w:jc w:val="center"/>
+        <w:pStyle w:val="Subtitle"/>
       </w:pPr>
       <w:r>
+        <w:t>A short document for checking the Word preview in GitLocal.</w:t>
+      </w:r>
+    </w:p>
+    <w:p>
+      <w:pPr>
+        <w:pStyle w:val="TOCHeading"/>
+      </w:pPr>
+      <w:r>
+        <w:t>Contents</w:t>
+      </w:r>
+    </w:p>
+    <w:p>
+      <w:r>
+        <w:fldChar w:fldCharType="begin"/>
+      </w:r>
+      <w:r>
+        <w:instrText xml:space="preserve"> TOC \o "1-2" \h </w:instrText>
+      </w:r>
+      <w:r>
+        <w:fldChar w:fldCharType="separate"/>
+      </w:r>
+    </w:p>
+    <w:p>
+      <w:pPr>
+        <w:tabs>
+          <w:tab w:val="right" w:leader="dot" w:pos="8630"/>
+        </w:tabs>
+        <w:ind w:left="0"/>
+      </w:pPr>
+      <w:r>
+        <w:t>1 Overview</w:t>
+      </w:r>
+      <w:r>
+        <w:tab/>
+      </w:r>
+      <w:r>
+        <w:t>1</w:t>
+      </w:r>
+    </w:p>
+    <w:p>
+      <w:pPr>
+        <w:tabs>
+          <w:tab w:val="right" w:leader="dot" w:pos="8630"/>
+        </w:tabs>
+        <w:ind w:left="0"/>
+      </w:pPr>
+      <w:r>
+        <w:t>2 Changes</w:t>
+      </w:r>
+      <w:r>
+        <w:tab/>
+      </w:r>
+      <w:r>
+        <w:t>1</w:t>
+      </w:r>
+    </w:p>
+    <w:p>
+      <w:pPr>
+        <w:tabs>
+          <w:tab w:val="right" w:leader="dot" w:pos="8630"/>
+        </w:tabs>
+        <w:ind w:left="220"/>
+      </w:pPr>
+      <w:r>
+        <w:t>2.1 Lists</w:t>
+      </w:r>
+      <w:r>
+        <w:tab/>
+      </w:r>
+      <w:r>
+        <w:t>1</w:t>
+      </w:r>
+    </w:p>
+    <w:p>
+      <w:pPr>
+        <w:tabs>
+          <w:tab w:val="right" w:leader="dot" w:pos="8630"/>
+        </w:tabs>
+        <w:ind w:left="220"/>
+      </w:pPr>
+      <w:r>
+        <w:t>2.2 Table</w:t>
+      </w:r>
+      <w:r>
+        <w:tab/>
+      </w:r>
+      <w:r>
+        <w:t>2</w:t>
+      </w:r>
+    </w:p>
+    <w:p>
+      <w:pPr>
+        <w:tabs>
+          <w:tab w:val="right" w:leader="dot" w:pos="8630"/>
+        </w:tabs>
+        <w:ind w:left="0"/>
+      </w:pPr>
+      <w:r>
+        <w:t>3 Layout</w:t>
+      </w:r>
+      <w:r>
+        <w:tab/>
+      </w:r>
+      <w:r>
+        <w:t>3</w:t>
+      </w:r>
+    </w:p>
+    <w:p>
+      <w:r>
+        <w:fldChar w:fldCharType="end"/>
+      </w:r>
+    </w:p>
+    <w:p>
+      <w:pPr>
+        <w:pStyle w:val="Heading1"/>
+      </w:pPr>
+      <w:r>
+        <w:t>1 Overview</w:t>
+      </w:r>
+    </w:p>
+    <w:p>
+      <w:r>
+        <w:t xml:space="preserve">This paragraph mixes </w:t>
+      </w:r>
+      <w:r>
         <w:rPr>
-          <w:color w:val="C00000"/>
-          <w:sz w:val="28"/>
+          <w:b/>
         </w:rPr>
-        <w:t>Centered red text</w:t>
+        <w:t>bold</w:t>
+      </w:r>
+      <w:r>
+        <w:t xml:space="preserve">, </w:t>
+      </w:r>
+      <w:r>
+        <w:rPr>
+          <w:i/>
+        </w:rPr>
+        <w:t>italic</w:t>
+      </w:r>
+      <w:r>
+        <w:t xml:space="preserve">, </w:t>
+      </w:r>
+      <w:r>
+        <w:rPr>
+          <w:u w:val="single"/>
+        </w:rPr>
+        <w:t>underlined</w:t>
+      </w:r>
+      <w:r>
+        <w:t xml:space="preserve">, </w:t>
+      </w:r>
+      <w:r>
+        <w:rPr>
+          <w:color w:val="C0392B"/>
+        </w:rPr>
+        <w:t>colored</w:t>
+      </w:r>
+      <w:r>
+        <w:t xml:space="preserve"> and </w:t>
+      </w:r>
+      <w:r>
+        <w:rPr>
+          <w:highlight w:val="yellow"/>
+        </w:rPr>
+        <w:t>highlighted</w:t>
+      </w:r>
+      <w:r>
+        <w:t xml:space="preserve"> text, plus E = mc</w:t>
+      </w:r>
+      <w:r>
+        <w:rPr>
+          <w:vertAlign w:val="superscript"/>
+        </w:rPr>
+        <w:t>2</w:t>
+      </w:r>
+      <w:r>
+        <w:t xml:space="preserve"> and H</w:t>
+      </w:r>
+      <w:r>
+        <w:rPr>
+          <w:vertAlign w:val="subscript"/>
+        </w:rPr>
+        <w:t>2</w:t>
+      </w:r>
+      <w:r>
+        <w:t xml:space="preserve">O. See </w:t>
+      </w:r>
+      <w:hyperlink r:id="rId11">
+        <w:r>
+          <w:rPr>
+            <w:rStyle w:val="Hyperlink"/>
+            <w:color w:val="0563C1"/>
+            <w:u w:val="single"/>
+          </w:rPr>
+          <w:t>gitlocal.dev</w:t>
+        </w:r>
+      </w:hyperlink>
+      <w:r>
+        <w:t xml:space="preserve"> for more.</w:t>
+      </w:r>
+      <w:r>
+        <w:rPr>
+          <w:vertAlign w:val="superscript"/>
+        </w:rPr>
+        <w:footnoteReference w:id="1"/>
+      </w:r>
+    </w:p>
+    <w:p>
+      <w:pPr>
+        <w:pStyle w:val="IntenseQuote"/>
+      </w:pPr>
+      <w:r>
+        <w:t>Notes are shown as accepted text; comments are not shown.</w:t>
+      </w:r>
+    </w:p>
+    <w:p>
+      <w:pPr>
+        <w:pStyle w:val="Heading1"/>
+      </w:pPr>
+      <w:r>
+        <w:t>2 Changes</w:t>
+      </w:r>
+    </w:p>
+    <w:p>
+      <w:pPr>
+        <w:pStyle w:val="Heading2"/>
+      </w:pPr>
+      <w:r>
+        <w:t>2.1 Lists</w:t>
       </w:r>
     </w:p>
     <w:p>
@@ -27,7 +251,23 @@
         <w:pStyle w:val="ListBullet"/>
       </w:pPr>
       <w:r>
-        <w:t>Bullet one</w:t>
+        <w:t>Preview Word documents</w:t>
+      </w:r>
+    </w:p>
+    <w:p>
+      <w:pPr>
+        <w:pStyle w:val="ListBullet2"/>
+      </w:pPr>
+      <w:r>
+        <w:t>Headers, footers and page breaks</w:t>
+      </w:r>
+    </w:p>
+    <w:p>
+      <w:pPr>
+        <w:pStyle w:val="ListBullet2"/>
+      </w:pPr>
+      <w:r>
+        <w:t>Tables with built-in styles</w:t>
       </w:r>
     </w:p>
     <w:p>
@@ -35,7 +275,7 @@
         <w:pStyle w:val="ListBullet"/>
       </w:pPr>
       <w:r>
-        <w:t>Bullet two</w:t>
+        <w:t>Links that open outside the app</w:t>
       </w:r>
     </w:p>
     <w:p>
@@ -43,7 +283,7 @@
         <w:pStyle w:val="ListNumber"/>
       </w:pPr>
       <w:r>
-        <w:t>Number one</w:t>
+        <w:t>Open the file in the tree</w:t>
       </w:r>
     </w:p>
     <w:p>
@@ -51,7 +291,23 @@
         <w:pStyle w:val="ListNumber"/>
       </w:pPr>
       <w:r>
-        <w:t>Number two</w:t>
+        <w:t>Zoom in or out from the toolbar</w:t>
+      </w:r>
+    </w:p>
+    <w:p>
+      <w:pPr>
+        <w:pStyle w:val="ListNumber"/>
+      </w:pPr>
+      <w:r>
+        <w:t>Follow the table of contents</w:t>
+      </w:r>
+    </w:p>
+    <w:p>
+      <w:pPr>
+        <w:pStyle w:val="Heading2"/>
+      </w:pPr>
+      <w:r>
+        <w:t>2.2 Table</w:t>
       </w:r>
     </w:p>
     <w:tbl>
@@ -72,7 +328,7 @@
           </w:tcPr>
           <w:p>
             <w:r>
-              <w:t>R0C0</w:t>
+              <w:t>Format</w:t>
             </w:r>
           </w:p>
         </w:tc>
@@ -82,7 +338,7 @@
           </w:tcPr>
           <w:p>
             <w:r>
-              <w:t>R0C1</w:t>
+              <w:t>Extension</w:t>
             </w:r>
           </w:p>
         </w:tc>
@@ -92,7 +348,7 @@
           </w:tcPr>
           <w:p>
             <w:r>
-              <w:t>R0C2</w:t>
+              <w:t>Editable</w:t>
             </w:r>
           </w:p>
         </w:tc>
@@ -104,7 +360,7 @@
           </w:tcPr>
           <w:p>
             <w:r>
-              <w:t>R1C0</w:t>
+              <w:t>Word</w:t>
             </w:r>
           </w:p>
         </w:tc>
@@ -114,7 +370,7 @@
           </w:tcPr>
           <w:p>
             <w:r>
-              <w:t>R1C1</w:t>
+              <w:t>.docx</w:t>
             </w:r>
           </w:p>
         </w:tc>
@@ -124,7 +380,7 @@
           </w:tcPr>
           <w:p>
             <w:r>
-              <w:t>R1C2</w:t>
+              <w:t>No</w:t>
             </w:r>
           </w:p>
         </w:tc>
@@ -136,7 +392,7 @@
           </w:tcPr>
           <w:p>
             <w:r>
-              <w:t>R2C0</w:t>
+              <w:t>PowerPoint</w:t>
             </w:r>
           </w:p>
         </w:tc>
@@ -146,7 +402,7 @@
           </w:tcPr>
           <w:p>
             <w:r>
-              <w:t>R2C1</w:t>
+              <w:t>.pptx</w:t>
             </w:r>
           </w:p>
         </w:tc>
@@ -156,37 +412,82 @@
           </w:tcPr>
           <w:p>
             <w:r>
-              <w:t>R2C2</w:t>
+              <w:t>No</w:t>
+            </w:r>
+          </w:p>
+        </w:tc>
+      </w:tr>
+      <w:tr>
+        <w:tc>
+          <w:tcPr>
+            <w:tcW w:type="dxa" w:w="2880"/>
+          </w:tcPr>
+          <w:p>
+            <w:r>
+              <w:t>Excel</w:t>
+            </w:r>
+          </w:p>
+        </w:tc>
+        <w:tc>
+          <w:tcPr>
+            <w:tcW w:type="dxa" w:w="2880"/>
+          </w:tcPr>
+          <w:p>
+            <w:r>
+              <w:t>.xlsx</w:t>
+            </w:r>
+          </w:p>
+        </w:tc>
+        <w:tc>
+          <w:tcPr>
+            <w:tcW w:type="dxa" w:w="2880"/>
+          </w:tcPr>
+          <w:p>
+            <w:r>
+              <w:t>No</w:t>
+            </w:r>
+          </w:p>
+        </w:tc>
+      </w:tr>
+      <w:tr>
+        <w:tc>
+          <w:tcPr>
+            <w:tcW w:type="dxa" w:w="2880"/>
+          </w:tcPr>
+          <w:p>
+            <w:r>
+              <w:t>Markdown</w:t>
+            </w:r>
+          </w:p>
+        </w:tc>
+        <w:tc>
+          <w:tcPr>
+            <w:tcW w:type="dxa" w:w="2880"/>
+          </w:tcPr>
+          <w:p>
+            <w:r>
+              <w:t>.md</w:t>
+            </w:r>
+          </w:p>
+        </w:tc>
+        <w:tc>
+          <w:tcPr>
+            <w:tcW w:type="dxa" w:w="2880"/>
+          </w:tcPr>
+          <w:p>
+            <w:r>
+              <w:t>Yes</w:t>
             </w:r>
           </w:p>
         </w:tc>
       </w:tr>
     </w:tbl>
-    <w:p>
-      <w:r>
-        <w:br w:type="page"/>
-      </w:r>
-    </w:p>
-    <w:p>
-      <w:pPr>
-        <w:pStyle w:val="Heading1"/>
-      </w:pPr>
-      <w:r>
-        <w:t>Second Page</w:t>
-      </w:r>
-    </w:p>
-    <w:p>
-      <w:r>
-        <w:t>Tab</w:t>
-        <w:tab/>
-        <w:t>separated</w:t>
-      </w:r>
-    </w:p>
+    <w:p/>
     <w:p>
       <w:r>
         <w:drawing>
           <wp:inline xmlns:a="http://schemas.openxmlformats.org/drawingml/2006/main" xmlns:pic="http://schemas.openxmlformats.org/drawingml/2006/picture">
-            <wp:extent cx="914400" cy="914400"/>
+            <wp:extent cx="1371600" cy="1371600"/>
             <wp:docPr id="1" name="Picture 1"/>
             <wp:cNvGraphicFramePr>
               <a:graphicFrameLocks noChangeAspect="1"/>
@@ -199,7 +500,7 @@
                     <pic:cNvPicPr/>
                   </pic:nvPicPr>
                   <pic:blipFill>
-                    <a:blip r:embed="rId11"/>
+                    <a:blip r:embed="rId12"/>
                     <a:stretch>
                       <a:fillRect/>
                     </a:stretch>
@@ -207,7 +508,7 @@
                   <pic:spPr>
                     <a:xfrm>
                       <a:off x="0" y="0"/>
-                      <a:ext cx="914400" cy="914400"/>
+                      <a:ext cx="1371600" cy="1371600"/>
                     </a:xfrm>
                     <a:prstGeom prst="rect"/>
                   </pic:spPr>
@@ -218,12 +519,85 @@
         </w:drawing>
       </w:r>
     </w:p>
+    <w:p>
+      <w:pPr>
+        <w:pStyle w:val="Caption"/>
+      </w:pPr>
+      <w:r>
+        <w:t>Figure 1: an embedded picture.</w:t>
+      </w:r>
+    </w:p>
+    <w:p>
+      <w:r>
+        <w:br w:type="page"/>
+      </w:r>
+    </w:p>
+    <w:p>
+      <w:pPr>
+        <w:pStyle w:val="Heading1"/>
+      </w:pPr>
+      <w:r>
+        <w:t>3 Layout</w:t>
+      </w:r>
+    </w:p>
+    <w:p>
+      <w:r>
+        <w:t>The next section uses two columns, set by a continuous section break.</w:t>
+      </w:r>
+    </w:p>
+    <w:p>
+      <w:pPr>
+        <w:sectPr>
+          <w:headerReference w:type="default" r:id="rId9"/>
+          <w:footerReference w:type="default" r:id="rId10"/>
+          <w:pgSz w:w="12240" w:h="15840"/>
+          <w:pgMar w:top="1440" w:right="1800" w:bottom="1440" w:left="1800" w:header="720" w:footer="720" w:gutter="0"/>
+          <w:cols w:space="720"/>
+          <w:docGrid w:linePitch="360"/>
+        </w:sectPr>
+      </w:pPr>
+    </w:p>
+    <w:p>
+      <w:r>
+        <w:t xml:space="preserve">GitLocal shows each section with its own page size, margins and columns. Text flows from the first column into the second, as it does in Word. GitLocal shows each section with its own page size, margins and columns. Text flows from the first column into the second, as it does in Word. </w:t>
+      </w:r>
+    </w:p>
+    <w:p>
+      <w:r>
+        <w:t xml:space="preserve">GitLocal shows each section with its own page size, margins and columns. Text flows from the first column into the second, as it does in Word. GitLocal shows each section with its own page size, margins and columns. Text flows from the first column into the second, as it does in Word. </w:t>
+      </w:r>
+    </w:p>
+    <w:p>
+      <w:r>
+        <w:t xml:space="preserve">GitLocal shows each section with its own page size, margins and columns. Text flows from the first column into the second, as it does in Word. GitLocal shows each section with its own page size, margins and columns. Text flows from the first column into the second, as it does in Word. </w:t>
+      </w:r>
+    </w:p>
+    <w:p>
+      <w:r>
+        <w:t xml:space="preserve">GitLocal shows each section with its own page size, margins and columns. Text flows from the first column into the second, as it does in Word. GitLocal shows each section with its own page size, margins and columns. Text flows from the first column into the second, as it does in Word. </w:t>
+      </w:r>
+    </w:p>
+    <w:p>
+      <w:pPr>
+        <w:sectPr>
+          <w:type w:val="continuous"/>
+          <w:pgSz w:w="12240" w:h="15840"/>
+          <w:pgMar w:top="1440" w:right="1800" w:bottom="1440" w:left="1800" w:header="720" w:footer="720" w:gutter="0"/>
+          <w:cols w:space="720" w:num="2"/>
+          <w:docGrid w:linePitch="360"/>
+        </w:sectPr>
+      </w:pPr>
+    </w:p>
+    <w:p>
+      <w:r>
+        <w:t>Back to one column for the end of the document.</w:t>
+      </w:r>
+    </w:p>
     <w:sectPr>
-      <w:headerReference w:type="default" r:id="rId9"/>
-      <w:footerReference w:type="default" r:id="rId10"/>
+      <w:type w:val="continuous"/>
       <w:pgSz w:w="12240" w:h="15840"/>
       <w:pgMar w:top="1440" w:right="1800" w:bottom="1440" w:left="1800" w:header="720" w:footer="720" w:gutter="0"/>
-      <w:cols w:space="720"/>
+      <w:cols w:space="720" w:num="1"/>
       <w:docGrid w:linePitch="360"/>
     </w:sectPr>
   </w:body>
@@ -237,12 +611,47 @@
       <w:pStyle w:val="Footer"/>
     </w:pPr>
     <w:r>
-      <w:t>Confidential Footer</w:t>
+      <w:t>sample.docx · preview-samples</w:t>
     </w:r>
   </w:p>
 </w:ftr>
 </file>
 
+<file path=word/footnotes.xml><?xml version="1.0" encoding="utf-8"?>
+<w:footnotes xmlns:w="http://schemas.openxmlformats.org/wordprocessingml/2006/main">
+  <w:footnote w:type="separator" w:id="-1">
+    <w:p>
+      <w:r>
+        <w:separator/>
+      </w:r>
+    </w:p>
+  </w:footnote>
+  <w:footnote w:type="continuationSeparator" w:id="0">
+    <w:p>
+      <w:r>
+        <w:continuationSeparator/>
+      </w:r>
+    </w:p>
+  </w:footnote>
+  <w:footnote w:id="1">
+    <w:p>
+      <w:pPr>
+        <w:pStyle w:val="FootnoteText"/>
+      </w:pPr>
+      <w:r>
+        <w:rPr>
+          <w:vertAlign w:val="superscript"/>
+        </w:rPr>
+        <w:footnoteRef/>
+      </w:r>
+      <w:r>
+        <w:t xml:space="preserve"> The website lists every supported preview.</w:t>
+      </w:r>
+    </w:p>
+  </w:footnote>
+</w:footnotes>
+</file>
+
 <file path=word/header1.xml><?xml version="1.0" encoding="utf-8"?>
 <w:hdr xmlns:m="http://schemas.openxmlformats.org/officeDocument/2006/math" xmlns:mc="http://schemas.openxmlformats.org/markup-compatibility/2006" xmlns:mo="http://schemas.microsoft.com/office/mac/office/2008/main" xmlns:mv="urn:schemas-microsoft-com:mac:vml" xmlns:o="urn:schemas-microsoft-com:office:office" xmlns:r="http://schemas.openxmlformats.org/officeDocument/2006/relationships" xmlns:v="urn:schemas-microsoft-com:vml" xmlns:w10="urn:schemas-microsoft-com:office:word" xmlns:w14="http://schemas.microsoft.com/office/word/2010/wordml" xmlns:w="http://schemas.openxmlformats.org/wordprocessingml/2006/main" xmlns:wne="http://schemas.microsoft.com/office/word/2006/wordml" xmlns:wp14="http://schemas.microsoft.com/office/word/2010/wordprocessingDrawing" xmlns:wp="http://schemas.openxmlformats.org/drawingml/2006/wordprocessingDrawing" xmlns:wpc="http://schemas.microsoft.com/office/word/2010/wordprocessingCanvas" xmlns:wpg="http://schemas.microsoft.com/office/word/2010/wordprocessingGroup" xmlns:wpi="http://schemas.microsoft.com/office/word/2010/wordprocessingInk" xmlns:wps="http://schemas.microsoft.com/office/word/2010/wordprocessingShape" mc:Ignorable="w14 wp14">
   <w:p>
@@ -250,7 +659,7 @@
       <w:pStyle w:val="Header"/>
     </w:pPr>
     <w:r>
-      <w:t>Quarterly Report Header</w:t>
+      <w:t>GitLocal sample document</w:t>
     </w:r>
   </w:p>
 </w:hdr>

</xml_diff>